<commit_message>
Verantwoordingsdocument: voedingspunt op een koppelstuk
De tool laat het aansluitpunt nu ook op een hoek, T-stuk of kruis toe, zonder
dat daar een onderdeel bij komt. Het document beschreef alleen de twee oude
gevallen, dus dan klopt de verantwoording niet meer met wat de tool doet.

Hoofdstuk 2, topologietabel: rij "Op een koppelstuk (hoek, T of kruis) -> Geen
apart onderdeel", met de reden erbij (er lopen draden doorheen waar de
voedingskabel doorheen getrokken wordt) en de datum van bevestiging.

Hoofdstuk 3, polariteitstabel: rij "Start: op een koppelstuk", met wat er met
de lijnzijde gebeurt - vrij te wisselen, en in een gesloten lus gaan alle
bochten tegelijk om van Binnen naar Buiten.

De arcering van beide tabellen wisselt weer om en om na het invoegen.

Co-Authored-By: Claude Opus 5 <noreply@anthropic.com>
Claude-Session: https://claude.ai/code/session_01JGZSjLFsjsFWhxQYJsHRZP
</commit_message>
<xml_diff>
--- a/railconfigurator-logica.docx
+++ b/railconfigurator-logica.docx
@@ -22,7 +22,6 @@
       <w:pPr>
         <w:spacing w:after="80"/>
       </w:pPr>
-      <w:proofErr w:type="spellStart"/>
       <w:r>
         <w:rPr>
           <w:b/>
@@ -31,18 +30,7 @@
           <w:sz w:val="40"/>
           <w:szCs w:val="40"/>
         </w:rPr>
-        <w:t>Railconfigurator</w:t>
-      </w:r>
-      <w:proofErr w:type="spellEnd"/>
-      <w:r>
-        <w:rPr>
-          <w:b/>
-          <w:bCs/>
-          <w:color w:val="0B1830"/>
-          <w:sz w:val="40"/>
-          <w:szCs w:val="40"/>
-        </w:rPr>
-        <w:t xml:space="preserve"> — logica, data en berekening</w:t>
+        <w:t xml:space="preserve">Railconfigurator — logica, data en berekening</w:t>
       </w:r>
     </w:p>
     <w:p>
@@ -55,25 +43,7 @@
           <w:iCs/>
           <w:color w:val="5B6B82"/>
         </w:rPr>
-        <w:t xml:space="preserve">Verantwoordingsdocument ter controle. Beschrijft welke productdata de </w:t>
-      </w:r>
-      <w:proofErr w:type="spellStart"/>
-      <w:r>
-        <w:rPr>
-          <w:i/>
-          <w:iCs/>
-          <w:color w:val="5B6B82"/>
-        </w:rPr>
-        <w:t>configurator</w:t>
-      </w:r>
-      <w:proofErr w:type="spellEnd"/>
-      <w:r>
-        <w:rPr>
-          <w:i/>
-          <w:iCs/>
-          <w:color w:val="5B6B82"/>
-        </w:rPr>
-        <w:t xml:space="preserve"> gebruikt, volgens welke regels hij onderdelen en polariteit toewijst, en hoe de railverdeling wordt berekend — inclusief narekenvoorbeelden en de punten die nog geverifieerd moeten worden.</w:t>
+        <w:t xml:space="preserve">Verantwoordingsdocument ter controle. Beschrijft welke productdata de configurator gebruikt, volgens welke regels hij onderdelen en polariteit toewijst, en hoe de railverdeling wordt berekend — inclusief narekenvoorbeelden en de punten die nog geverifieerd moeten worden.</w:t>
       </w:r>
     </w:p>
     <w:p>
@@ -141,15 +111,7 @@
         <w:t>(2) topologie</w:t>
       </w:r>
       <w:r>
-        <w:t xml:space="preserve"> — uit de vorm volgt per knooppunt welk </w:t>
-      </w:r>
-      <w:proofErr w:type="spellStart"/>
-      <w:r>
-        <w:t>týpe</w:t>
-      </w:r>
-      <w:proofErr w:type="spellEnd"/>
-      <w:r>
-        <w:t xml:space="preserve"> onderdeel er zit; </w:t>
+        <w:t xml:space="preserve"> — uit de vorm volgt per knooppunt welk týpe onderdeel er zit; </w:t>
       </w:r>
       <w:r>
         <w:rPr>
@@ -339,18 +301,8 @@
                 <w:sz w:val="19"/>
                 <w:szCs w:val="19"/>
               </w:rPr>
-              <w:t xml:space="preserve">Aansluitstuk óf </w:t>
-            </w:r>
-            <w:proofErr w:type="spellStart"/>
-            <w:r>
-              <w:rPr>
-                <w:color w:val="000000"/>
-                <w:sz w:val="19"/>
-                <w:szCs w:val="19"/>
-              </w:rPr>
-              <w:t>Eindkap</w:t>
-            </w:r>
-            <w:proofErr w:type="spellEnd"/>
+              <w:t xml:space="preserve">Aansluitstuk óf Eindkap</w:t>
+            </w:r>
           </w:p>
         </w:tc>
         <w:tc>
@@ -370,18 +322,8 @@
                 <w:sz w:val="19"/>
                 <w:szCs w:val="19"/>
               </w:rPr>
-              <w:t xml:space="preserve">Aansluitstuk als dit het gekozen voedingspunt is, anders </w:t>
-            </w:r>
-            <w:proofErr w:type="spellStart"/>
-            <w:r>
-              <w:rPr>
-                <w:color w:val="000000"/>
-                <w:sz w:val="19"/>
-                <w:szCs w:val="19"/>
-              </w:rPr>
-              <w:t>eindkap</w:t>
-            </w:r>
-            <w:proofErr w:type="spellEnd"/>
+              <w:t xml:space="preserve">Aansluitstuk als dit het gekozen voedingspunt is, anders eindkap</w:t>
+            </w:r>
           </w:p>
         </w:tc>
       </w:tr>
@@ -643,7 +585,6 @@
             </w:tcMar>
           </w:tcPr>
           <w:p>
-            <w:proofErr w:type="spellStart"/>
             <w:r>
               <w:rPr>
                 <w:color w:val="000000"/>
@@ -652,7 +593,6 @@
               </w:rPr>
               <w:t>Middenvoeding</w:t>
             </w:r>
-            <w:proofErr w:type="spellEnd"/>
           </w:p>
         </w:tc>
         <w:tc>
@@ -673,6 +613,80 @@
                 <w:szCs w:val="19"/>
               </w:rPr>
               <w:t>Alleen als de gebruiker dit als voedingspunt kiest</w:t>
+            </w:r>
+          </w:p>
+        </w:tc>
+      </w:tr>
+      <w:tr>
+        <w:tblPrEx>
+          <w:tblCellMar>
+            <w:top w:w="0" w:type="dxa"/>
+            <w:bottom w:w="0" w:type="dxa"/>
+          </w:tblCellMar>
+        </w:tblPrEx>
+        <w:tc>
+          <w:tcPr>
+            <w:tcW w:w="2400" w:type="dxa"/>
+            <w:shd w:val="clear" w:color="auto" w:fill="F4F5F8"/>
+            <w:tcMar>
+              <w:top w:w="70" w:type="dxa"/>
+              <w:left w:w="110" w:type="dxa"/>
+              <w:bottom w:w="70" w:type="dxa"/>
+              <w:right w:w="110" w:type="dxa"/>
+            </w:tcMar>
+          </w:tcPr>
+          <w:p>
+            <w:r>
+              <w:rPr>
+                <w:color w:val="000000"/>
+                <w:sz w:val="19"/>
+                <w:szCs w:val="19"/>
+              </w:rPr>
+              <w:t xml:space="preserve">Op een koppelstuk (hoek, T of kruis)</w:t>
+            </w:r>
+          </w:p>
+        </w:tc>
+        <w:tc>
+          <w:tcPr>
+            <w:tcW w:w="3400" w:type="dxa"/>
+            <w:shd w:val="clear" w:color="auto" w:fill="F4F5F8"/>
+            <w:tcMar>
+              <w:top w:w="70" w:type="dxa"/>
+              <w:left w:w="110" w:type="dxa"/>
+              <w:bottom w:w="70" w:type="dxa"/>
+              <w:right w:w="110" w:type="dxa"/>
+            </w:tcMar>
+          </w:tcPr>
+          <w:p>
+            <w:r>
+              <w:rPr>
+                <w:color w:val="000000"/>
+                <w:sz w:val="19"/>
+                <w:szCs w:val="19"/>
+              </w:rPr>
+              <w:t xml:space="preserve">Geen apart onderdeel</w:t>
+            </w:r>
+          </w:p>
+        </w:tc>
+        <w:tc>
+          <w:tcPr>
+            <w:tcW w:w="4200" w:type="dxa"/>
+            <w:shd w:val="clear" w:color="auto" w:fill="F4F5F8"/>
+            <w:tcMar>
+              <w:top w:w="70" w:type="dxa"/>
+              <w:left w:w="110" w:type="dxa"/>
+              <w:bottom w:w="70" w:type="dxa"/>
+              <w:right w:w="110" w:type="dxa"/>
+            </w:tcMar>
+          </w:tcPr>
+          <w:p>
+            <w:r>
+              <w:rPr>
+                <w:color w:val="000000"/>
+                <w:sz w:val="19"/>
+                <w:szCs w:val="19"/>
+              </w:rPr>
+              <w:t xml:space="preserve">Alleen als de gebruiker dit als voedingspunt kiest. Door het koppelstuk lopen draden waar de voedingskabel doorheen getrokken wordt, dus het koppelstuk blijft wat het volgens de regels hierboven al was. Bevestigd 19-8-2026.</w:t>
             </w:r>
           </w:p>
         </w:tc>
@@ -700,15 +714,7 @@
         <w:spacing w:after="140" w:line="300" w:lineRule="auto"/>
       </w:pPr>
       <w:r>
-        <w:t xml:space="preserve">De rode lijn uit het </w:t>
-      </w:r>
-      <w:proofErr w:type="spellStart"/>
-      <w:r>
-        <w:t>Pragmalux</w:t>
-      </w:r>
-      <w:proofErr w:type="spellEnd"/>
-      <w:r>
-        <w:t xml:space="preserve">-polariteitsschema loopt fysiek langs één zijde van het railprofiel en moet ononderbroken door het hele plan lopen. In het model krijgt elk segment daarom één attribuut: de </w:t>
+        <w:t xml:space="preserve">De rode lijn uit het Pragmalux-polariteitsschema loopt fysiek langs één zijde van het railprofiel en moet ononderbroken door het hele plan lopen. In het model krijgt elk segment daarom één attribuut: de </w:t>
       </w:r>
       <w:r>
         <w:rPr>
@@ -873,18 +879,8 @@
                 <w:sz w:val="19"/>
                 <w:szCs w:val="19"/>
               </w:rPr>
-              <w:t xml:space="preserve">Start: </w:t>
-            </w:r>
-            <w:proofErr w:type="spellStart"/>
-            <w:r>
-              <w:rPr>
-                <w:color w:val="000000"/>
-                <w:sz w:val="19"/>
-                <w:szCs w:val="19"/>
-              </w:rPr>
-              <w:t>middenvoeding</w:t>
-            </w:r>
-            <w:proofErr w:type="spellEnd"/>
+              <w:t xml:space="preserve">Start: middenvoeding</w:t>
+            </w:r>
           </w:p>
         </w:tc>
         <w:tc>
@@ -934,8 +930,7 @@
                 <w:sz w:val="19"/>
                 <w:szCs w:val="19"/>
               </w:rPr>
-              <w:lastRenderedPageBreak/>
-              <w:t>Recht stuk</w:t>
+              <w:t xml:space="preserve">Start: op een koppelstuk</w:t>
             </w:r>
           </w:p>
         </w:tc>
@@ -956,7 +951,7 @@
                 <w:sz w:val="19"/>
                 <w:szCs w:val="19"/>
               </w:rPr>
-              <w:t>Lijnzijde loopt ongewijzigd door.</w:t>
+              <w:t xml:space="preserve">De hoek, het T-stuk of het kruis blijft wat het is; er komt geen aansluitstuk bij. De lijnzijde is vrij en wisselt door op de voedingsmarkering te klikken. In een gesloten lus zet dat alle bochten tegelijk om van Binnen naar Buiten, want de lijn kan onderweg niet van zijde wisselen.</w:t>
             </w:r>
           </w:p>
         </w:tc>
@@ -986,7 +981,8 @@
                 <w:sz w:val="19"/>
                 <w:szCs w:val="19"/>
               </w:rPr>
-              <w:t>90° bocht</w:t>
+              <w:lastRenderedPageBreak/>
+              <w:t>Recht stuk</w:t>
             </w:r>
           </w:p>
         </w:tc>
@@ -1008,7 +1004,7 @@
                 <w:sz w:val="19"/>
                 <w:szCs w:val="19"/>
               </w:rPr>
-              <w:t>De lijn blijft aan dezelfde fysieke zijde. Ligt hij aan de binnenkant van de hoek → Bocht Binnen; aan de buitenkant → Bocht Buiten. Volledig bepaald, geen keuze.</w:t>
+              <w:t>Lijnzijde loopt ongewijzigd door.</w:t>
             </w:r>
           </w:p>
         </w:tc>
@@ -1037,7 +1033,7 @@
                 <w:sz w:val="19"/>
                 <w:szCs w:val="19"/>
               </w:rPr>
-              <w:t>T-koppelstuk</w:t>
+              <w:t>90° bocht</w:t>
             </w:r>
           </w:p>
         </w:tc>
@@ -1058,7 +1054,7 @@
                 <w:sz w:val="19"/>
                 <w:szCs w:val="19"/>
               </w:rPr>
-              <w:t>Via de doorgaande balk loopt de lijn rechtdoor op dezelfde zijde. De steelzijde is een vrije poort: voor beide zijden bestaat een product (dáárvoor bestaan de R/L-spiegelvarianten). Sluit de steel op een lus aan, dan dwingt de lus de zijde af; zo niet, dan kiest de tool de Rechts-variant als standaard.</w:t>
+              <w:t>De lijn blijft aan dezelfde fysieke zijde. Ligt hij aan de binnenkant van de hoek → Bocht Binnen; aan de buitenkant → Bocht Buiten. Volledig bepaald, geen keuze.</w:t>
             </w:r>
           </w:p>
         </w:tc>
@@ -1088,7 +1084,7 @@
                 <w:sz w:val="19"/>
                 <w:szCs w:val="19"/>
               </w:rPr>
-              <w:t>Kruis</w:t>
+              <w:t>T-koppelstuk</w:t>
             </w:r>
           </w:p>
         </w:tc>
@@ -1110,25 +1106,7 @@
                 <w:sz w:val="19"/>
                 <w:szCs w:val="19"/>
               </w:rPr>
-              <w:t xml:space="preserve">Per as loopt de lijn rechtdoor. De tweede as is net als de T-steel een vrije poort (het kruis is in vier oriëntaties </w:t>
-            </w:r>
-            <w:proofErr w:type="spellStart"/>
-            <w:r>
-              <w:rPr>
-                <w:color w:val="000000"/>
-                <w:sz w:val="19"/>
-                <w:szCs w:val="19"/>
-              </w:rPr>
-              <w:t>monteerbaar</w:t>
-            </w:r>
-            <w:proofErr w:type="spellEnd"/>
-            <w:r>
-              <w:rPr>
-                <w:color w:val="000000"/>
-                <w:sz w:val="19"/>
-                <w:szCs w:val="19"/>
-              </w:rPr>
-              <w:t>).</w:t>
+              <w:t>Via de doorgaande balk loopt de lijn rechtdoor op dezelfde zijde. De steelzijde is een vrije poort: voor beide zijden bestaat een product (dáárvoor bestaan de R/L-spiegelvarianten). Sluit de steel op een lus aan, dan dwingt de lus de zijde af; zo niet, dan kiest de tool de Rechts-variant als standaard.</w:t>
             </w:r>
           </w:p>
         </w:tc>
@@ -1157,6 +1135,57 @@
                 <w:sz w:val="19"/>
                 <w:szCs w:val="19"/>
               </w:rPr>
+              <w:t>Kruis</w:t>
+            </w:r>
+          </w:p>
+        </w:tc>
+        <w:tc>
+          <w:tcPr>
+            <w:tcW w:w="7400" w:type="dxa"/>
+            <w:tcMar>
+              <w:top w:w="70" w:type="dxa"/>
+              <w:left w:w="110" w:type="dxa"/>
+              <w:bottom w:w="70" w:type="dxa"/>
+              <w:right w:w="110" w:type="dxa"/>
+            </w:tcMar>
+          </w:tcPr>
+          <w:p>
+            <w:r>
+              <w:rPr>
+                <w:color w:val="000000"/>
+                <w:sz w:val="19"/>
+                <w:szCs w:val="19"/>
+              </w:rPr>
+              <w:t xml:space="preserve">Per as loopt de lijn rechtdoor. De tweede as is net als de T-steel een vrije poort (het kruis is in vier oriëntaties monteerbaar).</w:t>
+            </w:r>
+          </w:p>
+        </w:tc>
+      </w:tr>
+      <w:tr>
+        <w:tblPrEx>
+          <w:tblCellMar>
+            <w:top w:w="0" w:type="dxa"/>
+            <w:bottom w:w="0" w:type="dxa"/>
+          </w:tblCellMar>
+        </w:tblPrEx>
+        <w:tc>
+          <w:tcPr>
+            <w:tcW w:w="2600" w:type="dxa"/>
+            <w:shd w:val="clear" w:color="auto" w:fill="F4F5F8"/>
+            <w:tcMar>
+              <w:top w:w="70" w:type="dxa"/>
+              <w:left w:w="110" w:type="dxa"/>
+              <w:bottom w:w="70" w:type="dxa"/>
+              <w:right w:w="110" w:type="dxa"/>
+            </w:tcMar>
+          </w:tcPr>
+          <w:p>
+            <w:r>
+              <w:rPr>
+                <w:color w:val="000000"/>
+                <w:sz w:val="19"/>
+                <w:szCs w:val="19"/>
+              </w:rPr>
               <w:t>Conflict</w:t>
             </w:r>
           </w:p>
@@ -1164,6 +1193,7 @@
         <w:tc>
           <w:tcPr>
             <w:tcW w:w="7400" w:type="dxa"/>
+            <w:shd w:val="clear" w:color="auto" w:fill="F4F5F8"/>
             <w:tcMar>
               <w:top w:w="70" w:type="dxa"/>
               <w:left w:w="110" w:type="dxa"/>
@@ -1236,15 +1266,7 @@
         <w:t>zichtbare deel</w:t>
       </w:r>
       <w:r>
-        <w:t xml:space="preserve"> van het koppelstuk mee in de getekende maat; het koppeldeel (ca. 33 mm) schuift ín de rail en neemt geen ruimte in. Bron: </w:t>
-      </w:r>
-      <w:proofErr w:type="spellStart"/>
-      <w:r>
-        <w:t>maatvoeringstekeningen</w:t>
-      </w:r>
-      <w:proofErr w:type="spellEnd"/>
-      <w:r>
-        <w:t xml:space="preserve"> uit de technische presenter, leeswijze bevestigd voor bocht en T-stuk.</w:t>
+        <w:t xml:space="preserve"> van het koppelstuk mee in de getekende maat; het koppeldeel (ca. 33 mm) schuift ín de rail en neemt geen ruimte in. Bron: maatvoeringstekeningen uit de technische presenter, leeswijze bevestigd voor bocht en T-stuk.</w:t>
       </w:r>
     </w:p>
     <w:tbl>
@@ -1612,15 +1634,7 @@
                 <w:sz w:val="19"/>
                 <w:szCs w:val="19"/>
               </w:rPr>
-              <w:t>66</w:t>
-            </w:r>
-            <w:r>
-              <w:rPr>
-                <w:color w:val="000000"/>
-                <w:sz w:val="19"/>
-                <w:szCs w:val="19"/>
-              </w:rPr>
-              <w:t xml:space="preserve"> mm</w:t>
+              <w:t xml:space="preserve">66 mm</w:t>
             </w:r>
           </w:p>
         </w:tc>
@@ -1737,41 +1751,13 @@
             </w:tcMar>
           </w:tcPr>
           <w:p>
-            <w:proofErr w:type="spellStart"/>
-            <w:r>
-              <w:rPr>
-                <w:color w:val="000000"/>
-                <w:sz w:val="19"/>
-                <w:szCs w:val="19"/>
-              </w:rPr>
-              <w:t>Middenvoeding</w:t>
-            </w:r>
-            <w:proofErr w:type="spellEnd"/>
-            <w:r>
-              <w:rPr>
-                <w:color w:val="000000"/>
-                <w:sz w:val="19"/>
-                <w:szCs w:val="19"/>
-              </w:rPr>
-              <w:t xml:space="preserve"> (</w:t>
-            </w:r>
-            <w:proofErr w:type="spellStart"/>
-            <w:r>
-              <w:rPr>
-                <w:color w:val="000000"/>
-                <w:sz w:val="19"/>
-                <w:szCs w:val="19"/>
-              </w:rPr>
-              <w:t>inline</w:t>
-            </w:r>
-            <w:proofErr w:type="spellEnd"/>
-            <w:r>
-              <w:rPr>
-                <w:color w:val="000000"/>
-                <w:sz w:val="19"/>
-                <w:szCs w:val="19"/>
-              </w:rPr>
-              <w:t>)</w:t>
+            <w:r>
+              <w:rPr>
+                <w:color w:val="000000"/>
+                <w:sz w:val="19"/>
+                <w:szCs w:val="19"/>
+              </w:rPr>
+              <w:t xml:space="preserve">Middenvoeding (inline)</w:t>
             </w:r>
           </w:p>
         </w:tc>
@@ -1809,7 +1795,6 @@
             </w:tcMar>
           </w:tcPr>
           <w:p>
-            <w:proofErr w:type="gramStart"/>
             <w:r>
               <w:rPr>
                 <w:color w:val="000000"/>
@@ -1818,7 +1803,6 @@
               </w:rPr>
               <w:t>bevestigd</w:t>
             </w:r>
-            <w:proofErr w:type="gramEnd"/>
           </w:p>
         </w:tc>
       </w:tr>
@@ -1882,7 +1866,6 @@
             </w:tcMar>
           </w:tcPr>
           <w:p>
-            <w:proofErr w:type="gramStart"/>
             <w:r>
               <w:rPr>
                 <w:color w:val="000000"/>
@@ -1891,7 +1874,6 @@
               </w:rPr>
               <w:t>bevestigd</w:t>
             </w:r>
-            <w:proofErr w:type="gramEnd"/>
           </w:p>
         </w:tc>
       </w:tr>
@@ -1914,7 +1896,6 @@
             </w:tcMar>
           </w:tcPr>
           <w:p>
-            <w:proofErr w:type="spellStart"/>
             <w:r>
               <w:rPr>
                 <w:color w:val="000000"/>
@@ -1923,7 +1904,6 @@
               </w:rPr>
               <w:t>Eindkap</w:t>
             </w:r>
-            <w:proofErr w:type="spellEnd"/>
           </w:p>
         </w:tc>
         <w:tc>
@@ -1944,15 +1924,7 @@
                 <w:sz w:val="19"/>
                 <w:szCs w:val="19"/>
               </w:rPr>
-              <w:t>3</w:t>
-            </w:r>
-            <w:r>
-              <w:rPr>
-                <w:color w:val="000000"/>
-                <w:sz w:val="19"/>
-                <w:szCs w:val="19"/>
-              </w:rPr>
-              <w:t xml:space="preserve"> mm</w:t>
+              <w:t xml:space="preserve">3 mm</w:t>
             </w:r>
           </w:p>
         </w:tc>
@@ -1974,15 +1946,7 @@
                 <w:sz w:val="19"/>
                 <w:szCs w:val="19"/>
               </w:rPr>
-              <w:t>Bevestig</w:t>
-            </w:r>
-            <w:r>
-              <w:rPr>
-                <w:color w:val="000000"/>
-                <w:sz w:val="19"/>
-                <w:szCs w:val="19"/>
-              </w:rPr>
-              <w:t>d</w:t>
+              <w:t>Bevestigd</w:t>
             </w:r>
           </w:p>
         </w:tc>
@@ -2010,15 +1974,7 @@
         <w:spacing w:after="140" w:line="300" w:lineRule="auto"/>
       </w:pPr>
       <w:r>
-        <w:t xml:space="preserve">Rail is leverbaar per 1, 2 en 3 meter; 4 meter is een bestelartikel dat alleen op aanvraag wordt ingezet. Rail kan op maat gezaagd worden. De </w:t>
-      </w:r>
-      <w:proofErr w:type="spellStart"/>
-      <w:r>
-        <w:t>configurator</w:t>
-      </w:r>
-      <w:proofErr w:type="spellEnd"/>
-      <w:r>
-        <w:t xml:space="preserve"> gebruikt de volgende artikelnummers (bron: presenter/artikellijst):</w:t>
+        <w:t xml:space="preserve">Rail is leverbaar per 1, 2 en 3 meter; 4 meter is een bestelartikel dat alleen op aanvraag wordt ingezet. Rail kan op maat gezaagd worden. De configurator gebruikt de volgende artikelnummers (bron: presenter/artikellijst):</w:t>
       </w:r>
     </w:p>
     <w:tbl>
@@ -3388,7 +3344,6 @@
             </w:tcMar>
           </w:tcPr>
           <w:p>
-            <w:proofErr w:type="spellStart"/>
             <w:r>
               <w:rPr>
                 <w:color w:val="000000"/>
@@ -3397,7 +3352,6 @@
               </w:rPr>
               <w:t>Middenvoeding</w:t>
             </w:r>
-            <w:proofErr w:type="spellEnd"/>
           </w:p>
         </w:tc>
         <w:tc>
@@ -3485,7 +3439,6 @@
             </w:tcMar>
           </w:tcPr>
           <w:p>
-            <w:proofErr w:type="spellStart"/>
             <w:r>
               <w:rPr>
                 <w:color w:val="000000"/>
@@ -3494,7 +3447,6 @@
               </w:rPr>
               <w:t>Eindkap</w:t>
             </w:r>
-            <w:proofErr w:type="spellEnd"/>
           </w:p>
         </w:tc>
         <w:tc>
@@ -3878,15 +3830,7 @@
         <w:spacing w:after="140" w:line="300" w:lineRule="auto"/>
       </w:pPr>
       <w:r>
-        <w:t xml:space="preserve">Koppelstukken, aansluitpunt en </w:t>
-      </w:r>
-      <w:proofErr w:type="spellStart"/>
-      <w:r>
-        <w:t>middenvoeding</w:t>
-      </w:r>
-      <w:proofErr w:type="spellEnd"/>
-      <w:r>
-        <w:t xml:space="preserve"> komen in werkelijkheid </w:t>
+        <w:t xml:space="preserve">Koppelstukken, aansluitpunt en middenvoeding komen in werkelijkheid </w:t>
       </w:r>
       <w:r>
         <w:rPr>
@@ -3903,41 +3847,13 @@
       <w:pPr>
         <w:spacing w:after="140" w:line="300" w:lineRule="auto"/>
       </w:pPr>
-      <w:proofErr w:type="gramStart"/>
       <w:r>
         <w:rPr>
           <w:rFonts w:ascii="Consolas" w:eastAsia="Consolas" w:hAnsi="Consolas" w:cs="Consolas"/>
           <w:sz w:val="20"/>
           <w:szCs w:val="20"/>
         </w:rPr>
-        <w:t>werkelijke</w:t>
-      </w:r>
-      <w:proofErr w:type="gramEnd"/>
-      <w:r>
-        <w:rPr>
-          <w:rFonts w:ascii="Consolas" w:eastAsia="Consolas" w:hAnsi="Consolas" w:cs="Consolas"/>
-          <w:sz w:val="20"/>
-          <w:szCs w:val="20"/>
-        </w:rPr>
-        <w:t xml:space="preserve"> maat = raillengte + inbouwmaat knooppunt A + inbouwmaat knooppunt B (+ 100 mm bij </w:t>
-      </w:r>
-      <w:proofErr w:type="spellStart"/>
-      <w:r>
-        <w:rPr>
-          <w:rFonts w:ascii="Consolas" w:eastAsia="Consolas" w:hAnsi="Consolas" w:cs="Consolas"/>
-          <w:sz w:val="20"/>
-          <w:szCs w:val="20"/>
-        </w:rPr>
-        <w:t>middenvoeding</w:t>
-      </w:r>
-      <w:proofErr w:type="spellEnd"/>
-      <w:r>
-        <w:rPr>
-          <w:rFonts w:ascii="Consolas" w:eastAsia="Consolas" w:hAnsi="Consolas" w:cs="Consolas"/>
-          <w:sz w:val="20"/>
-          <w:szCs w:val="20"/>
-        </w:rPr>
-        <w:t>)</w:t>
+        <w:t xml:space="preserve">werkelijke maat = raillengte + inbouwmaat knooppunt A + inbouwmaat knooppunt B (+ 100 mm bij middenvoeding)</w:t>
       </w:r>
     </w:p>
     <w:p>
@@ -4078,25 +3994,7 @@
                 <w:sz w:val="19"/>
                 <w:szCs w:val="19"/>
               </w:rPr>
-              <w:t xml:space="preserve">9 m recht stuk (aansluitstuk + </w:t>
-            </w:r>
-            <w:proofErr w:type="spellStart"/>
-            <w:r>
-              <w:rPr>
-                <w:color w:val="000000"/>
-                <w:sz w:val="19"/>
-                <w:szCs w:val="19"/>
-              </w:rPr>
-              <w:t>eindkap</w:t>
-            </w:r>
-            <w:proofErr w:type="spellEnd"/>
-            <w:r>
-              <w:rPr>
-                <w:color w:val="000000"/>
-                <w:sz w:val="19"/>
-                <w:szCs w:val="19"/>
-              </w:rPr>
-              <w:t>)</w:t>
+              <w:t xml:space="preserve">9 m recht stuk (aansluitstuk + eindkap)</w:t>
             </w:r>
           </w:p>
         </w:tc>
@@ -4241,25 +4139,7 @@
                 <w:sz w:val="19"/>
                 <w:szCs w:val="19"/>
               </w:rPr>
-              <w:t xml:space="preserve">2 m met </w:t>
-            </w:r>
-            <w:proofErr w:type="spellStart"/>
-            <w:r>
-              <w:rPr>
-                <w:color w:val="000000"/>
-                <w:sz w:val="19"/>
-                <w:szCs w:val="19"/>
-              </w:rPr>
-              <w:t>middenvoeding</w:t>
-            </w:r>
-            <w:proofErr w:type="spellEnd"/>
-            <w:r>
-              <w:rPr>
-                <w:color w:val="000000"/>
-                <w:sz w:val="19"/>
-                <w:szCs w:val="19"/>
-              </w:rPr>
-              <w:t xml:space="preserve"> (bocht–T-balk)</w:t>
+              <w:t xml:space="preserve">2 m met middenvoeding (bocht–T-balk)</w:t>
             </w:r>
           </w:p>
         </w:tc>
@@ -4280,18 +4160,8 @@
                 <w:sz w:val="19"/>
                 <w:szCs w:val="19"/>
               </w:rPr>
-              <w:t xml:space="preserve">1 × 2 m + </w:t>
-            </w:r>
-            <w:proofErr w:type="spellStart"/>
-            <w:r>
-              <w:rPr>
-                <w:color w:val="000000"/>
-                <w:sz w:val="19"/>
-                <w:szCs w:val="19"/>
-              </w:rPr>
-              <w:t>middenvoeding</w:t>
-            </w:r>
-            <w:proofErr w:type="spellEnd"/>
+              <w:t xml:space="preserve">1 × 2 m + middenvoeding</w:t>
+            </w:r>
           </w:p>
         </w:tc>
         <w:tc>
@@ -4584,25 +4454,7 @@
                 <w:sz w:val="19"/>
                 <w:szCs w:val="19"/>
               </w:rPr>
-              <w:t xml:space="preserve">Vier afgeleide inbouwmaten: aansluitstuk 66, kruis 50/arm, </w:t>
-            </w:r>
-            <w:proofErr w:type="spellStart"/>
-            <w:r>
-              <w:rPr>
-                <w:color w:val="000000"/>
-                <w:sz w:val="19"/>
-                <w:szCs w:val="19"/>
-              </w:rPr>
-              <w:t>middenvoeding</w:t>
-            </w:r>
-            <w:proofErr w:type="spellEnd"/>
-            <w:r>
-              <w:rPr>
-                <w:color w:val="000000"/>
-                <w:sz w:val="19"/>
-                <w:szCs w:val="19"/>
-              </w:rPr>
-              <w:t xml:space="preserve"> 100, elektrisch koppelstuk 0 mm</w:t>
+              <w:t xml:space="preserve">Vier afgeleide inbouwmaten: aansluitstuk 66, kruis 50/arm, middenvoeding 100, elektrisch koppelstuk 0 mm</w:t>
             </w:r>
           </w:p>
         </w:tc>
@@ -4623,25 +4475,7 @@
                 <w:sz w:val="19"/>
                 <w:szCs w:val="19"/>
               </w:rPr>
-              <w:t>Datablad-</w:t>
-            </w:r>
-            <w:proofErr w:type="gramStart"/>
-            <w:r>
-              <w:rPr>
-                <w:color w:val="000000"/>
-                <w:sz w:val="19"/>
-                <w:szCs w:val="19"/>
-              </w:rPr>
-              <w:t>maatvoering /</w:t>
-            </w:r>
-            <w:proofErr w:type="gramEnd"/>
-            <w:r>
-              <w:rPr>
-                <w:color w:val="000000"/>
-                <w:sz w:val="19"/>
-                <w:szCs w:val="19"/>
-              </w:rPr>
-              <w:t xml:space="preserve"> fysiek onderdeel</w:t>
+              <w:t xml:space="preserve">Datablad-maatvoering / fysiek onderdeel</w:t>
             </w:r>
           </w:p>
         </w:tc>
@@ -4693,25 +4527,7 @@
                 <w:sz w:val="19"/>
                 <w:szCs w:val="19"/>
               </w:rPr>
-              <w:t xml:space="preserve">Naamtoewijzing van de vier T-varianten (welke lijnzijde-combinatie heet R1/L1/R2/T2) — de propagatie zelf is deterministisch, alleen de koppeling </w:t>
-            </w:r>
-            <w:proofErr w:type="spellStart"/>
-            <w:r>
-              <w:rPr>
-                <w:color w:val="000000"/>
-                <w:sz w:val="19"/>
-                <w:szCs w:val="19"/>
-              </w:rPr>
-              <w:t>naam↔artikelnummer</w:t>
-            </w:r>
-            <w:proofErr w:type="spellEnd"/>
-            <w:r>
-              <w:rPr>
-                <w:color w:val="000000"/>
-                <w:sz w:val="19"/>
-                <w:szCs w:val="19"/>
-              </w:rPr>
-              <w:t xml:space="preserve"> is voorlopig</w:t>
+              <w:t xml:space="preserve">Naamtoewijzing van de vier T-varianten (welke lijnzijde-combinatie heet R1/L1/R2/T2) — de propagatie zelf is deterministisch, alleen de koppeling naam↔artikelnummer is voorlopig</w:t>
             </w:r>
           </w:p>
         </w:tc>

</xml_diff>